<commit_message>
EndOfDay category API methods and more. See releaseNotes.docx for further details
</commit_message>
<xml_diff>
--- a/ReleaseNotes.docx
+++ b/ReleaseNotes.docx
@@ -42,6 +42,365 @@
           <w:u w:val="single"/>
           <w:lang w:val="en-US"/>
         </w:rPr>
+        <w:t>5</w:t>
+      </w:r>
+      <w:r>
+        <w:rPr>
+          <w:b/>
+          <w:bCs/>
+          <w:u w:val="single"/>
+          <w:lang w:val="en-US"/>
+        </w:rPr>
+        <w:t>/</w:t>
+      </w:r>
+      <w:r>
+        <w:rPr>
+          <w:b/>
+          <w:bCs/>
+          <w:u w:val="single"/>
+          <w:lang w:val="en-US"/>
+        </w:rPr>
+        <w:t>6/</w:t>
+      </w:r>
+      <w:r>
+        <w:rPr>
+          <w:b/>
+          <w:bCs/>
+          <w:u w:val="single"/>
+          <w:lang w:val="en-US"/>
+        </w:rPr>
+        <w:t>202</w:t>
+      </w:r>
+      <w:r>
+        <w:rPr>
+          <w:b/>
+          <w:bCs/>
+          <w:u w:val="single"/>
+          <w:lang w:val="en-US"/>
+        </w:rPr>
+        <w:t>5</w:t>
+      </w:r>
+    </w:p>
+    <w:p>
+      <w:pPr>
+        <w:pStyle w:val="ListParagraph"/>
+        <w:numPr>
+          <w:ilvl w:val="0"/>
+          <w:numId w:val="11"/>
+        </w:numPr>
+        <w:rPr>
+          <w:b/>
+          <w:bCs/>
+          <w:u w:val="single"/>
+          <w:lang w:val="en-US"/>
+        </w:rPr>
+      </w:pPr>
+      <w:r>
+        <w:rPr>
+          <w:lang w:val="en-US"/>
+        </w:rPr>
+        <w:t>New OpenAPI specification category: EndOfDay with 4 new methods</w:t>
+      </w:r>
+    </w:p>
+    <w:p>
+      <w:pPr>
+        <w:pStyle w:val="ListParagraph"/>
+        <w:numPr>
+          <w:ilvl w:val="0"/>
+          <w:numId w:val="11"/>
+        </w:numPr>
+        <w:rPr>
+          <w:b/>
+          <w:bCs/>
+          <w:u w:val="single"/>
+          <w:lang w:val="en-US"/>
+        </w:rPr>
+      </w:pPr>
+      <w:r>
+        <w:rPr>
+          <w:lang w:val="en-US"/>
+        </w:rPr>
+        <w:t xml:space="preserve">SetBusinessDay moved from “Other” category to EndOfDay. Now on SetBusinessDay is used when i-Apply side needs to set the CBS business day and the GetBusinessDay when the i-Apply requesting the Business Day from the CBS. </w:t>
+      </w:r>
+    </w:p>
+    <w:p>
+      <w:pPr>
+        <w:pStyle w:val="ListParagraph"/>
+        <w:numPr>
+          <w:ilvl w:val="0"/>
+          <w:numId w:val="11"/>
+        </w:numPr>
+        <w:rPr>
+          <w:b/>
+          <w:bCs/>
+          <w:u w:val="single"/>
+          <w:lang w:val="en-US"/>
+        </w:rPr>
+      </w:pPr>
+      <w:r>
+        <w:rPr>
+          <w:lang w:val="en-US"/>
+        </w:rPr>
+        <w:t>Only the SetBusinessDay is available via i-Apply User Interface. All the other methods of the “EndOfDay” category are used by the night operation, and other (CLI) utilities.</w:t>
+      </w:r>
+    </w:p>
+    <w:p>
+      <w:pPr>
+        <w:pStyle w:val="ListParagraph"/>
+        <w:numPr>
+          <w:ilvl w:val="0"/>
+          <w:numId w:val="11"/>
+        </w:numPr>
+        <w:rPr>
+          <w:b/>
+          <w:bCs/>
+          <w:u w:val="single"/>
+          <w:lang w:val="en-US"/>
+        </w:rPr>
+      </w:pPr>
+      <w:r>
+        <w:rPr>
+          <w:lang w:val="en-US"/>
+        </w:rPr>
+        <w:t xml:space="preserve">New Document: </w:t>
+      </w:r>
+      <w:r>
+        <w:rPr>
+          <w:lang w:val="en-US"/>
+        </w:rPr>
+        <w:t>EndOfDay_API_Specification.docx</w:t>
+      </w:r>
+      <w:r>
+        <w:rPr>
+          <w:lang w:val="en-US"/>
+        </w:rPr>
+        <w:t xml:space="preserve"> in the folder: </w:t>
+      </w:r>
+      <w:r>
+        <w:rPr>
+          <w:lang w:val="en-US"/>
+        </w:rPr>
+        <w:t>IA_CCBS_BANK_SIDE\EndOfDay</w:t>
+      </w:r>
+      <w:r>
+        <w:rPr>
+          <w:lang w:val="en-US"/>
+        </w:rPr>
+        <w:t>.</w:t>
+      </w:r>
+      <w:r>
+        <w:rPr>
+          <w:lang w:val="en-US"/>
+        </w:rPr>
+        <w:t xml:space="preserve"> Describes all the EndOfDay methods and the business behind them. </w:t>
+      </w:r>
+    </w:p>
+    <w:p>
+      <w:pPr>
+        <w:pStyle w:val="ListParagraph"/>
+        <w:numPr>
+          <w:ilvl w:val="0"/>
+          <w:numId w:val="11"/>
+        </w:numPr>
+        <w:rPr>
+          <w:b/>
+          <w:bCs/>
+          <w:u w:val="single"/>
+          <w:lang w:val="en-US"/>
+        </w:rPr>
+      </w:pPr>
+      <w:r>
+        <w:rPr>
+          <w:lang w:val="en-US"/>
+        </w:rPr>
+        <w:t>Update</w:t>
+      </w:r>
+      <w:r>
+        <w:rPr>
+          <w:lang w:val="en-US"/>
+        </w:rPr>
+        <w:t>d</w:t>
+      </w:r>
+      <w:r>
+        <w:rPr>
+          <w:lang w:val="en-US"/>
+        </w:rPr>
+        <w:t xml:space="preserve"> OpenAPI specification: </w:t>
+      </w:r>
+      <w:r>
+        <w:rPr>
+          <w:lang w:val="en-US"/>
+        </w:rPr>
+        <w:t>CCBS_API.json</w:t>
+      </w:r>
+    </w:p>
+    <w:p>
+      <w:pPr>
+        <w:pStyle w:val="ListParagraph"/>
+        <w:numPr>
+          <w:ilvl w:val="0"/>
+          <w:numId w:val="11"/>
+        </w:numPr>
+        <w:rPr>
+          <w:b/>
+          <w:bCs/>
+          <w:u w:val="single"/>
+          <w:lang w:val="en-US"/>
+        </w:rPr>
+      </w:pPr>
+      <w:r>
+        <w:rPr>
+          <w:lang w:val="en-US"/>
+        </w:rPr>
+        <w:t>Moved from [Light (</w:t>
+      </w:r>
+      <w:r>
+        <w:rPr>
+          <w:lang w:val="en-US"/>
+        </w:rPr>
+        <w:t xml:space="preserve">aka </w:t>
+      </w:r>
+      <w:r>
+        <w:rPr>
+          <w:lang w:val="en-US"/>
+        </w:rPr>
+        <w:t>Green] group to [Customer] group</w:t>
+      </w:r>
+    </w:p>
+    <w:p>
+      <w:pPr>
+        <w:pStyle w:val="ListParagraph"/>
+        <w:numPr>
+          <w:ilvl w:val="1"/>
+          <w:numId w:val="11"/>
+        </w:numPr>
+        <w:rPr>
+          <w:lang w:val="en-US"/>
+        </w:rPr>
+      </w:pPr>
+      <w:r>
+        <w:rPr>
+          <w:lang w:val="en-US"/>
+        </w:rPr>
+        <w:t>UpdateIndividualCustomer</w:t>
+      </w:r>
+    </w:p>
+    <w:p>
+      <w:pPr>
+        <w:pStyle w:val="ListParagraph"/>
+        <w:numPr>
+          <w:ilvl w:val="1"/>
+          <w:numId w:val="11"/>
+        </w:numPr>
+        <w:rPr>
+          <w:lang w:val="en-US"/>
+        </w:rPr>
+      </w:pPr>
+      <w:r>
+        <w:rPr>
+          <w:lang w:val="en-US"/>
+        </w:rPr>
+        <w:t>UpdateLegalCustomer</w:t>
+      </w:r>
+    </w:p>
+    <w:p>
+      <w:pPr>
+        <w:pStyle w:val="ListParagraph"/>
+        <w:numPr>
+          <w:ilvl w:val="1"/>
+          <w:numId w:val="11"/>
+        </w:numPr>
+        <w:rPr>
+          <w:lang w:val="en-US"/>
+        </w:rPr>
+      </w:pPr>
+      <w:r>
+        <w:rPr>
+          <w:lang w:val="en-US"/>
+        </w:rPr>
+        <w:t>CreateIndividualCustomer</w:t>
+      </w:r>
+    </w:p>
+    <w:p>
+      <w:pPr>
+        <w:pStyle w:val="ListParagraph"/>
+        <w:numPr>
+          <w:ilvl w:val="1"/>
+          <w:numId w:val="11"/>
+        </w:numPr>
+        <w:rPr>
+          <w:lang w:val="en-US"/>
+        </w:rPr>
+      </w:pPr>
+      <w:r>
+        <w:rPr>
+          <w:lang w:val="en-US"/>
+        </w:rPr>
+        <w:t>CreateLegalCustomer</w:t>
+      </w:r>
+    </w:p>
+    <w:p>
+      <w:pPr>
+        <w:pStyle w:val="ListParagraph"/>
+        <w:numPr>
+          <w:ilvl w:val="1"/>
+          <w:numId w:val="11"/>
+        </w:numPr>
+        <w:rPr>
+          <w:lang w:val="en-US"/>
+        </w:rPr>
+      </w:pPr>
+      <w:r>
+        <w:rPr>
+          <w:lang w:val="en-US"/>
+        </w:rPr>
+        <w:t>GetCustomerRelationships</w:t>
+      </w:r>
+    </w:p>
+    <w:p>
+      <w:pPr>
+        <w:pStyle w:val="ListParagraph"/>
+        <w:numPr>
+          <w:ilvl w:val="1"/>
+          <w:numId w:val="11"/>
+        </w:numPr>
+        <w:rPr>
+          <w:lang w:val="en-US"/>
+        </w:rPr>
+      </w:pPr>
+      <w:r>
+        <w:rPr>
+          <w:lang w:val="en-US"/>
+        </w:rPr>
+        <w:t>UpdateCustomerRelationships</w:t>
+      </w:r>
+    </w:p>
+    <w:p>
+      <w:pPr>
+        <w:rPr>
+          <w:b/>
+          <w:bCs/>
+          <w:u w:val="single"/>
+          <w:lang w:val="en-US"/>
+        </w:rPr>
+      </w:pPr>
+    </w:p>
+    <w:p>
+      <w:pPr>
+        <w:rPr>
+          <w:b/>
+          <w:bCs/>
+          <w:u w:val="single"/>
+          <w:lang w:val="en-US"/>
+        </w:rPr>
+      </w:pPr>
+      <w:r>
+        <w:rPr>
+          <w:b/>
+          <w:bCs/>
+          <w:u w:val="single"/>
+          <w:lang w:val="en-US"/>
+        </w:rPr>
         <w:t>12</w:t>
       </w:r>
       <w:r>
@@ -475,6 +834,7 @@
         <w:rPr>
           <w:lang w:val="en-US"/>
         </w:rPr>
+        <w:lastRenderedPageBreak/>
         <w:t xml:space="preserve">Modifications to </w:t>
       </w:r>
       <w:r>
@@ -774,7 +1134,6 @@
           <w:u w:val="single"/>
           <w:lang w:val="en-US"/>
         </w:rPr>
-        <w:lastRenderedPageBreak/>
         <w:t>10/5/2024</w:t>
       </w:r>
     </w:p>
@@ -1794,6 +2153,119 @@
     </w:lvl>
   </w:abstractNum>
   <w:abstractNum w:abstractNumId="2" w15:restartNumberingAfterBreak="0">
+    <w:nsid w:val="39984243"/>
+    <w:multiLevelType w:val="hybridMultilevel"/>
+    <w:tmpl w:val="7CA08C2C"/>
+    <w:lvl w:ilvl="0" w:tplc="04080001">
+      <w:start w:val="1"/>
+      <w:numFmt w:val="bullet"/>
+      <w:lvlText w:val=""/>
+      <w:lvlJc w:val="left"/>
+      <w:pPr>
+        <w:ind w:left="720" w:hanging="360"/>
+      </w:pPr>
+      <w:rPr>
+        <w:rFonts w:ascii="Symbol" w:hAnsi="Symbol" w:hint="default"/>
+      </w:rPr>
+    </w:lvl>
+    <w:lvl w:ilvl="1" w:tplc="04080003">
+      <w:start w:val="1"/>
+      <w:numFmt w:val="bullet"/>
+      <w:lvlText w:val="o"/>
+      <w:lvlJc w:val="left"/>
+      <w:pPr>
+        <w:ind w:left="1440" w:hanging="360"/>
+      </w:pPr>
+      <w:rPr>
+        <w:rFonts w:ascii="Courier New" w:hAnsi="Courier New" w:cs="Courier New" w:hint="default"/>
+      </w:rPr>
+    </w:lvl>
+    <w:lvl w:ilvl="2" w:tplc="04080005" w:tentative="1">
+      <w:start w:val="1"/>
+      <w:numFmt w:val="bullet"/>
+      <w:lvlText w:val=""/>
+      <w:lvlJc w:val="left"/>
+      <w:pPr>
+        <w:ind w:left="2160" w:hanging="360"/>
+      </w:pPr>
+      <w:rPr>
+        <w:rFonts w:ascii="Wingdings" w:hAnsi="Wingdings" w:hint="default"/>
+      </w:rPr>
+    </w:lvl>
+    <w:lvl w:ilvl="3" w:tplc="04080001" w:tentative="1">
+      <w:start w:val="1"/>
+      <w:numFmt w:val="bullet"/>
+      <w:lvlText w:val=""/>
+      <w:lvlJc w:val="left"/>
+      <w:pPr>
+        <w:ind w:left="2880" w:hanging="360"/>
+      </w:pPr>
+      <w:rPr>
+        <w:rFonts w:ascii="Symbol" w:hAnsi="Symbol" w:hint="default"/>
+      </w:rPr>
+    </w:lvl>
+    <w:lvl w:ilvl="4" w:tplc="04080003" w:tentative="1">
+      <w:start w:val="1"/>
+      <w:numFmt w:val="bullet"/>
+      <w:lvlText w:val="o"/>
+      <w:lvlJc w:val="left"/>
+      <w:pPr>
+        <w:ind w:left="3600" w:hanging="360"/>
+      </w:pPr>
+      <w:rPr>
+        <w:rFonts w:ascii="Courier New" w:hAnsi="Courier New" w:cs="Courier New" w:hint="default"/>
+      </w:rPr>
+    </w:lvl>
+    <w:lvl w:ilvl="5" w:tplc="04080005" w:tentative="1">
+      <w:start w:val="1"/>
+      <w:numFmt w:val="bullet"/>
+      <w:lvlText w:val=""/>
+      <w:lvlJc w:val="left"/>
+      <w:pPr>
+        <w:ind w:left="4320" w:hanging="360"/>
+      </w:pPr>
+      <w:rPr>
+        <w:rFonts w:ascii="Wingdings" w:hAnsi="Wingdings" w:hint="default"/>
+      </w:rPr>
+    </w:lvl>
+    <w:lvl w:ilvl="6" w:tplc="04080001" w:tentative="1">
+      <w:start w:val="1"/>
+      <w:numFmt w:val="bullet"/>
+      <w:lvlText w:val=""/>
+      <w:lvlJc w:val="left"/>
+      <w:pPr>
+        <w:ind w:left="5040" w:hanging="360"/>
+      </w:pPr>
+      <w:rPr>
+        <w:rFonts w:ascii="Symbol" w:hAnsi="Symbol" w:hint="default"/>
+      </w:rPr>
+    </w:lvl>
+    <w:lvl w:ilvl="7" w:tplc="04080003" w:tentative="1">
+      <w:start w:val="1"/>
+      <w:numFmt w:val="bullet"/>
+      <w:lvlText w:val="o"/>
+      <w:lvlJc w:val="left"/>
+      <w:pPr>
+        <w:ind w:left="5760" w:hanging="360"/>
+      </w:pPr>
+      <w:rPr>
+        <w:rFonts w:ascii="Courier New" w:hAnsi="Courier New" w:cs="Courier New" w:hint="default"/>
+      </w:rPr>
+    </w:lvl>
+    <w:lvl w:ilvl="8" w:tplc="04080005" w:tentative="1">
+      <w:start w:val="1"/>
+      <w:numFmt w:val="bullet"/>
+      <w:lvlText w:val=""/>
+      <w:lvlJc w:val="left"/>
+      <w:pPr>
+        <w:ind w:left="6480" w:hanging="360"/>
+      </w:pPr>
+      <w:rPr>
+        <w:rFonts w:ascii="Wingdings" w:hAnsi="Wingdings" w:hint="default"/>
+      </w:rPr>
+    </w:lvl>
+  </w:abstractNum>
+  <w:abstractNum w:abstractNumId="3" w15:restartNumberingAfterBreak="0">
     <w:nsid w:val="3A20200B"/>
     <w:multiLevelType w:val="hybridMultilevel"/>
     <w:tmpl w:val="E5AA3F5C"/>
@@ -1906,7 +2378,7 @@
       </w:rPr>
     </w:lvl>
   </w:abstractNum>
-  <w:abstractNum w:abstractNumId="3" w15:restartNumberingAfterBreak="0">
+  <w:abstractNum w:abstractNumId="4" w15:restartNumberingAfterBreak="0">
     <w:nsid w:val="3D047DD2"/>
     <w:multiLevelType w:val="hybridMultilevel"/>
     <w:tmpl w:val="72EE8088"/>
@@ -2019,7 +2491,7 @@
       </w:rPr>
     </w:lvl>
   </w:abstractNum>
-  <w:abstractNum w:abstractNumId="4" w15:restartNumberingAfterBreak="0">
+  <w:abstractNum w:abstractNumId="5" w15:restartNumberingAfterBreak="0">
     <w:nsid w:val="46C52D91"/>
     <w:multiLevelType w:val="hybridMultilevel"/>
     <w:tmpl w:val="6A20D872"/>
@@ -2132,7 +2604,7 @@
       </w:rPr>
     </w:lvl>
   </w:abstractNum>
-  <w:abstractNum w:abstractNumId="5" w15:restartNumberingAfterBreak="0">
+  <w:abstractNum w:abstractNumId="6" w15:restartNumberingAfterBreak="0">
     <w:nsid w:val="55061529"/>
     <w:multiLevelType w:val="hybridMultilevel"/>
     <w:tmpl w:val="EC66A4FE"/>
@@ -2245,7 +2717,7 @@
       </w:rPr>
     </w:lvl>
   </w:abstractNum>
-  <w:abstractNum w:abstractNumId="6" w15:restartNumberingAfterBreak="0">
+  <w:abstractNum w:abstractNumId="7" w15:restartNumberingAfterBreak="0">
     <w:nsid w:val="5B9D6C84"/>
     <w:multiLevelType w:val="hybridMultilevel"/>
     <w:tmpl w:val="BCC451F8"/>
@@ -2358,7 +2830,7 @@
       </w:rPr>
     </w:lvl>
   </w:abstractNum>
-  <w:abstractNum w:abstractNumId="7" w15:restartNumberingAfterBreak="0">
+  <w:abstractNum w:abstractNumId="8" w15:restartNumberingAfterBreak="0">
     <w:nsid w:val="5EC60A7B"/>
     <w:multiLevelType w:val="hybridMultilevel"/>
     <w:tmpl w:val="A23C87D2"/>
@@ -2471,7 +2943,7 @@
       </w:rPr>
     </w:lvl>
   </w:abstractNum>
-  <w:abstractNum w:abstractNumId="8" w15:restartNumberingAfterBreak="0">
+  <w:abstractNum w:abstractNumId="9" w15:restartNumberingAfterBreak="0">
     <w:nsid w:val="5F9F30F7"/>
     <w:multiLevelType w:val="hybridMultilevel"/>
     <w:tmpl w:val="4B6E4A6A"/>
@@ -2584,7 +3056,7 @@
       </w:rPr>
     </w:lvl>
   </w:abstractNum>
-  <w:abstractNum w:abstractNumId="9" w15:restartNumberingAfterBreak="0">
+  <w:abstractNum w:abstractNumId="10" w15:restartNumberingAfterBreak="0">
     <w:nsid w:val="6A230C2E"/>
     <w:multiLevelType w:val="hybridMultilevel"/>
     <w:tmpl w:val="FB6042C2"/>
@@ -2701,31 +3173,34 @@
     <w:abstractNumId w:val="0"/>
   </w:num>
   <w:num w:numId="2" w16cid:durableId="2031253423">
+    <w:abstractNumId w:val="4"/>
+  </w:num>
+  <w:num w:numId="3" w16cid:durableId="1420328916">
+    <w:abstractNumId w:val="5"/>
+  </w:num>
+  <w:num w:numId="4" w16cid:durableId="56319394">
+    <w:abstractNumId w:val="7"/>
+  </w:num>
+  <w:num w:numId="5" w16cid:durableId="973412357">
     <w:abstractNumId w:val="3"/>
   </w:num>
-  <w:num w:numId="3" w16cid:durableId="1420328916">
-    <w:abstractNumId w:val="4"/>
-  </w:num>
-  <w:num w:numId="4" w16cid:durableId="56319394">
-    <w:abstractNumId w:val="6"/>
-  </w:num>
-  <w:num w:numId="5" w16cid:durableId="973412357">
-    <w:abstractNumId w:val="2"/>
-  </w:num>
   <w:num w:numId="6" w16cid:durableId="1190874115">
-    <w:abstractNumId w:val="7"/>
+    <w:abstractNumId w:val="8"/>
   </w:num>
   <w:num w:numId="7" w16cid:durableId="130639784">
-    <w:abstractNumId w:val="8"/>
+    <w:abstractNumId w:val="9"/>
   </w:num>
   <w:num w:numId="8" w16cid:durableId="1817603195">
-    <w:abstractNumId w:val="9"/>
+    <w:abstractNumId w:val="10"/>
   </w:num>
   <w:num w:numId="9" w16cid:durableId="1647011411">
-    <w:abstractNumId w:val="5"/>
+    <w:abstractNumId w:val="6"/>
   </w:num>
   <w:num w:numId="10" w16cid:durableId="564991538">
     <w:abstractNumId w:val="1"/>
+  </w:num>
+  <w:num w:numId="11" w16cid:durableId="1976836869">
+    <w:abstractNumId w:val="2"/>
   </w:num>
 </w:numbering>
 </file>
@@ -3130,7 +3605,7 @@
   <w:style w:type="paragraph" w:default="1" w:styleId="Normal">
     <w:name w:val="Normal"/>
     <w:qFormat/>
-    <w:rsid w:val="00864D97"/>
+    <w:rsid w:val="000971C5"/>
   </w:style>
   <w:style w:type="character" w:default="1" w:styleId="DefaultParagraphFont">
     <w:name w:val="Default Paragraph Font"/>

</xml_diff>

<commit_message>
Documents (xls) modifications. See release notes for further info.
</commit_message>
<xml_diff>
--- a/ReleaseNotes.docx
+++ b/ReleaseNotes.docx
@@ -99,7 +99,35 @@
         <w:rPr>
           <w:lang w:val="en-US"/>
         </w:rPr>
-        <w:t>New OpenAPI specification category: EndOfDay with 4 new methods</w:t>
+        <w:t xml:space="preserve">New </w:t>
+      </w:r>
+      <w:proofErr w:type="spellStart"/>
+      <w:r>
+        <w:rPr>
+          <w:lang w:val="en-US"/>
+        </w:rPr>
+        <w:t>OpenAPI</w:t>
+      </w:r>
+      <w:proofErr w:type="spellEnd"/>
+      <w:r>
+        <w:rPr>
+          <w:lang w:val="en-US"/>
+        </w:rPr>
+        <w:t xml:space="preserve"> specification category: </w:t>
+      </w:r>
+      <w:proofErr w:type="spellStart"/>
+      <w:r>
+        <w:rPr>
+          <w:lang w:val="en-US"/>
+        </w:rPr>
+        <w:t>EndOfDay</w:t>
+      </w:r>
+      <w:proofErr w:type="spellEnd"/>
+      <w:r>
+        <w:rPr>
+          <w:lang w:val="en-US"/>
+        </w:rPr>
+        <w:t xml:space="preserve"> with 4 new methods</w:t>
       </w:r>
     </w:p>
     <w:p>
@@ -116,11 +144,89 @@
           <w:lang w:val="en-US"/>
         </w:rPr>
       </w:pPr>
-      <w:r>
-        <w:rPr>
-          <w:lang w:val="en-US"/>
-        </w:rPr>
-        <w:t xml:space="preserve">SetBusinessDay moved from “Other” category to EndOfDay. Now on SetBusinessDay is used when i-Apply side needs to set the CBS business day and the GetBusinessDay when the i-Apply requesting the Business Day from the CBS. </w:t>
+      <w:proofErr w:type="spellStart"/>
+      <w:r>
+        <w:rPr>
+          <w:lang w:val="en-US"/>
+        </w:rPr>
+        <w:t>SetBusinessDay</w:t>
+      </w:r>
+      <w:proofErr w:type="spellEnd"/>
+      <w:r>
+        <w:rPr>
+          <w:lang w:val="en-US"/>
+        </w:rPr>
+        <w:t xml:space="preserve"> moved from “Other” category to </w:t>
+      </w:r>
+      <w:proofErr w:type="spellStart"/>
+      <w:r>
+        <w:rPr>
+          <w:lang w:val="en-US"/>
+        </w:rPr>
+        <w:t>EndOfDay</w:t>
+      </w:r>
+      <w:proofErr w:type="spellEnd"/>
+      <w:r>
+        <w:rPr>
+          <w:lang w:val="en-US"/>
+        </w:rPr>
+        <w:t xml:space="preserve">. Now on </w:t>
+      </w:r>
+      <w:proofErr w:type="spellStart"/>
+      <w:r>
+        <w:rPr>
+          <w:lang w:val="en-US"/>
+        </w:rPr>
+        <w:t>SetBusinessDay</w:t>
+      </w:r>
+      <w:proofErr w:type="spellEnd"/>
+      <w:r>
+        <w:rPr>
+          <w:lang w:val="en-US"/>
+        </w:rPr>
+        <w:t xml:space="preserve"> is used when </w:t>
+      </w:r>
+      <w:proofErr w:type="spellStart"/>
+      <w:r>
+        <w:rPr>
+          <w:lang w:val="en-US"/>
+        </w:rPr>
+        <w:t>i</w:t>
+      </w:r>
+      <w:proofErr w:type="spellEnd"/>
+      <w:r>
+        <w:rPr>
+          <w:lang w:val="en-US"/>
+        </w:rPr>
+        <w:t xml:space="preserve">-Apply side needs to set the CBS business day and the </w:t>
+      </w:r>
+      <w:proofErr w:type="spellStart"/>
+      <w:r>
+        <w:rPr>
+          <w:lang w:val="en-US"/>
+        </w:rPr>
+        <w:t>GetBusinessDay</w:t>
+      </w:r>
+      <w:proofErr w:type="spellEnd"/>
+      <w:r>
+        <w:rPr>
+          <w:lang w:val="en-US"/>
+        </w:rPr>
+        <w:t xml:space="preserve"> when the </w:t>
+      </w:r>
+      <w:proofErr w:type="spellStart"/>
+      <w:r>
+        <w:rPr>
+          <w:lang w:val="en-US"/>
+        </w:rPr>
+        <w:t>i</w:t>
+      </w:r>
+      <w:proofErr w:type="spellEnd"/>
+      <w:r>
+        <w:rPr>
+          <w:lang w:val="en-US"/>
+        </w:rPr>
+        <w:t xml:space="preserve">-Apply requesting the Business Day from the CBS. </w:t>
       </w:r>
     </w:p>
     <w:p>
@@ -141,7 +247,49 @@
         <w:rPr>
           <w:lang w:val="en-US"/>
         </w:rPr>
-        <w:t>Only the SetBusinessDay is available via i-Apply User Interface. All the other methods of the “EndOfDay” category are used by the night operation, and other (CLI) utilities.</w:t>
+        <w:t xml:space="preserve">Only the </w:t>
+      </w:r>
+      <w:proofErr w:type="spellStart"/>
+      <w:r>
+        <w:rPr>
+          <w:lang w:val="en-US"/>
+        </w:rPr>
+        <w:t>SetBusinessDay</w:t>
+      </w:r>
+      <w:proofErr w:type="spellEnd"/>
+      <w:r>
+        <w:rPr>
+          <w:lang w:val="en-US"/>
+        </w:rPr>
+        <w:t xml:space="preserve"> is available via </w:t>
+      </w:r>
+      <w:proofErr w:type="spellStart"/>
+      <w:r>
+        <w:rPr>
+          <w:lang w:val="en-US"/>
+        </w:rPr>
+        <w:t>i</w:t>
+      </w:r>
+      <w:proofErr w:type="spellEnd"/>
+      <w:r>
+        <w:rPr>
+          <w:lang w:val="en-US"/>
+        </w:rPr>
+        <w:t>-Apply User Interface. All the other methods of the “</w:t>
+      </w:r>
+      <w:proofErr w:type="spellStart"/>
+      <w:r>
+        <w:rPr>
+          <w:lang w:val="en-US"/>
+        </w:rPr>
+        <w:t>EndOfDay</w:t>
+      </w:r>
+      <w:proofErr w:type="spellEnd"/>
+      <w:r>
+        <w:rPr>
+          <w:lang w:val="en-US"/>
+        </w:rPr>
+        <w:t>” category are used by the night operation, and other (CLI) utilities.</w:t>
       </w:r>
     </w:p>
     <w:p>
@@ -180,8 +328,16 @@
         <w:rPr>
           <w:lang w:val="en-US"/>
         </w:rPr>
-        <w:t>IA_CCBS_BANK_SIDE\EndOfDay</w:t>
-      </w:r>
+        <w:t>IA_CCBS_BANK_SIDE\</w:t>
+      </w:r>
+      <w:proofErr w:type="spellStart"/>
+      <w:r>
+        <w:rPr>
+          <w:lang w:val="en-US"/>
+        </w:rPr>
+        <w:t>EndOfDay</w:t>
+      </w:r>
+      <w:proofErr w:type="spellEnd"/>
       <w:r>
         <w:rPr>
           <w:lang w:val="en-US"/>
@@ -192,7 +348,21 @@
         <w:rPr>
           <w:lang w:val="en-US"/>
         </w:rPr>
-        <w:t xml:space="preserve"> Describes all the EndOfDay methods and the business behind them. </w:t>
+        <w:t xml:space="preserve"> Describes all the </w:t>
+      </w:r>
+      <w:proofErr w:type="spellStart"/>
+      <w:r>
+        <w:rPr>
+          <w:lang w:val="en-US"/>
+        </w:rPr>
+        <w:t>EndOfDay</w:t>
+      </w:r>
+      <w:proofErr w:type="spellEnd"/>
+      <w:r>
+        <w:rPr>
+          <w:lang w:val="en-US"/>
+        </w:rPr>
+        <w:t xml:space="preserve"> methods and the business behind them. </w:t>
       </w:r>
     </w:p>
     <w:p>
@@ -225,14 +395,30 @@
         <w:rPr>
           <w:lang w:val="en-US"/>
         </w:rPr>
-        <w:t xml:space="preserve"> OpenAPI specification: </w:t>
-      </w:r>
+        <w:t xml:space="preserve"> </w:t>
+      </w:r>
+      <w:proofErr w:type="spellStart"/>
+      <w:r>
+        <w:rPr>
+          <w:lang w:val="en-US"/>
+        </w:rPr>
+        <w:t>OpenAPI</w:t>
+      </w:r>
+      <w:proofErr w:type="spellEnd"/>
+      <w:r>
+        <w:rPr>
+          <w:lang w:val="en-US"/>
+        </w:rPr>
+        <w:t xml:space="preserve"> specification: </w:t>
+      </w:r>
+      <w:proofErr w:type="spellStart"/>
       <w:r>
         <w:rPr>
           <w:lang w:val="en-US"/>
         </w:rPr>
         <w:t>CCBS_API.json</w:t>
       </w:r>
+      <w:proofErr w:type="spellEnd"/>
     </w:p>
     <w:p>
       <w:pPr>
@@ -278,12 +464,14 @@
           <w:lang w:val="en-US"/>
         </w:rPr>
       </w:pPr>
+      <w:proofErr w:type="spellStart"/>
       <w:r>
         <w:rPr>
           <w:lang w:val="en-US"/>
         </w:rPr>
         <w:t>UpdateIndividualCustomer</w:t>
       </w:r>
+      <w:proofErr w:type="spellEnd"/>
     </w:p>
     <w:p>
       <w:pPr>
@@ -296,12 +484,14 @@
           <w:lang w:val="en-US"/>
         </w:rPr>
       </w:pPr>
+      <w:proofErr w:type="spellStart"/>
       <w:r>
         <w:rPr>
           <w:lang w:val="en-US"/>
         </w:rPr>
         <w:t>UpdateLegalCustomer</w:t>
       </w:r>
+      <w:proofErr w:type="spellEnd"/>
     </w:p>
     <w:p>
       <w:pPr>
@@ -314,12 +504,14 @@
           <w:lang w:val="en-US"/>
         </w:rPr>
       </w:pPr>
+      <w:proofErr w:type="spellStart"/>
       <w:r>
         <w:rPr>
           <w:lang w:val="en-US"/>
         </w:rPr>
         <w:t>CreateIndividualCustomer</w:t>
       </w:r>
+      <w:proofErr w:type="spellEnd"/>
     </w:p>
     <w:p>
       <w:pPr>
@@ -332,12 +524,14 @@
           <w:lang w:val="en-US"/>
         </w:rPr>
       </w:pPr>
+      <w:proofErr w:type="spellStart"/>
       <w:r>
         <w:rPr>
           <w:lang w:val="en-US"/>
         </w:rPr>
         <w:t>CreateLegalCustomer</w:t>
       </w:r>
+      <w:proofErr w:type="spellEnd"/>
     </w:p>
     <w:p>
       <w:pPr>
@@ -350,12 +544,14 @@
           <w:lang w:val="en-US"/>
         </w:rPr>
       </w:pPr>
+      <w:proofErr w:type="spellStart"/>
       <w:r>
         <w:rPr>
           <w:lang w:val="en-US"/>
         </w:rPr>
         <w:t>GetCustomerRelationships</w:t>
       </w:r>
+      <w:proofErr w:type="spellEnd"/>
     </w:p>
     <w:p>
       <w:pPr>
@@ -368,11 +564,223 @@
           <w:lang w:val="en-US"/>
         </w:rPr>
       </w:pPr>
+      <w:proofErr w:type="spellStart"/>
       <w:r>
         <w:rPr>
           <w:lang w:val="en-US"/>
         </w:rPr>
         <w:t>UpdateCustomerRelationships</w:t>
+      </w:r>
+      <w:proofErr w:type="spellEnd"/>
+    </w:p>
+    <w:p>
+      <w:pPr>
+        <w:pStyle w:val="ListParagraph"/>
+        <w:numPr>
+          <w:ilvl w:val="0"/>
+          <w:numId w:val="11"/>
+        </w:numPr>
+        <w:rPr>
+          <w:lang w:val="en-US"/>
+        </w:rPr>
+      </w:pPr>
+      <w:r>
+        <w:rPr>
+          <w:lang w:val="en-US"/>
+        </w:rPr>
+        <w:t>Modifications on excel documents:</w:t>
+      </w:r>
+    </w:p>
+    <w:p>
+      <w:pPr>
+        <w:pStyle w:val="ListParagraph"/>
+        <w:numPr>
+          <w:ilvl w:val="1"/>
+          <w:numId w:val="11"/>
+        </w:numPr>
+        <w:rPr>
+          <w:lang w:val="en-US"/>
+        </w:rPr>
+      </w:pPr>
+      <w:proofErr w:type="spellStart"/>
+      <w:r>
+        <w:rPr>
+          <w:lang w:val="en-US"/>
+        </w:rPr>
+        <w:t>AccountOther</w:t>
+      </w:r>
+      <w:proofErr w:type="spellEnd"/>
+      <w:r>
+        <w:rPr>
+          <w:lang w:val="en-US"/>
+        </w:rPr>
+        <w:t>/LoanAccountOpening_InstantProcess.xlsx</w:t>
+      </w:r>
+    </w:p>
+    <w:p>
+      <w:pPr>
+        <w:pStyle w:val="ListParagraph"/>
+        <w:numPr>
+          <w:ilvl w:val="1"/>
+          <w:numId w:val="11"/>
+        </w:numPr>
+        <w:rPr>
+          <w:lang w:val="en-US"/>
+        </w:rPr>
+      </w:pPr>
+      <w:r>
+        <w:rPr>
+          <w:lang w:val="en-US"/>
+        </w:rPr>
+        <w:t xml:space="preserve">        modified:   </w:t>
+      </w:r>
+      <w:proofErr w:type="spellStart"/>
+      <w:r>
+        <w:rPr>
+          <w:lang w:val="en-US"/>
+        </w:rPr>
+        <w:t>AccountOther</w:t>
+      </w:r>
+      <w:proofErr w:type="spellEnd"/>
+      <w:r>
+        <w:rPr>
+          <w:lang w:val="en-US"/>
+        </w:rPr>
+        <w:t>/LoanAccountUpdate_InstantProcess.xlsx</w:t>
+      </w:r>
+    </w:p>
+    <w:p>
+      <w:pPr>
+        <w:pStyle w:val="ListParagraph"/>
+        <w:numPr>
+          <w:ilvl w:val="1"/>
+          <w:numId w:val="11"/>
+        </w:numPr>
+        <w:rPr>
+          <w:lang w:val="en-US"/>
+        </w:rPr>
+      </w:pPr>
+      <w:r>
+        <w:rPr>
+          <w:lang w:val="en-US"/>
+        </w:rPr>
+        <w:t xml:space="preserve">        modified:   </w:t>
+      </w:r>
+      <w:proofErr w:type="spellStart"/>
+      <w:r>
+        <w:rPr>
+          <w:lang w:val="en-US"/>
+        </w:rPr>
+        <w:t>RepaymentSchedule</w:t>
+      </w:r>
+      <w:proofErr w:type="spellEnd"/>
+      <w:r>
+        <w:rPr>
+          <w:lang w:val="en-US"/>
+        </w:rPr>
+        <w:t>/RepaymentSchedule_Save.xlsx</w:t>
+      </w:r>
+    </w:p>
+    <w:p>
+      <w:pPr>
+        <w:pStyle w:val="ListParagraph"/>
+        <w:numPr>
+          <w:ilvl w:val="1"/>
+          <w:numId w:val="11"/>
+        </w:numPr>
+        <w:rPr>
+          <w:lang w:val="en-US"/>
+        </w:rPr>
+      </w:pPr>
+      <w:r>
+        <w:rPr>
+          <w:lang w:val="en-US"/>
+        </w:rPr>
+        <w:t xml:space="preserve">        modified:   </w:t>
+      </w:r>
+      <w:proofErr w:type="spellStart"/>
+      <w:r>
+        <w:rPr>
+          <w:lang w:val="en-US"/>
+        </w:rPr>
+        <w:t>RepaymentSchedule</w:t>
+      </w:r>
+      <w:proofErr w:type="spellEnd"/>
+      <w:r>
+        <w:rPr>
+          <w:lang w:val="en-US"/>
+        </w:rPr>
+        <w:t>/RepaymentSchedule_Simulation.xlsx</w:t>
+      </w:r>
+    </w:p>
+    <w:p>
+      <w:pPr>
+        <w:pStyle w:val="ListParagraph"/>
+        <w:numPr>
+          <w:ilvl w:val="0"/>
+          <w:numId w:val="11"/>
+        </w:numPr>
+        <w:rPr>
+          <w:lang w:val="en-US"/>
+        </w:rPr>
+      </w:pPr>
+      <w:r>
+        <w:rPr>
+          <w:lang w:val="en-US"/>
+        </w:rPr>
+        <w:t>New excel documents:</w:t>
+      </w:r>
+    </w:p>
+    <w:p>
+      <w:pPr>
+        <w:pStyle w:val="ListParagraph"/>
+        <w:numPr>
+          <w:ilvl w:val="1"/>
+          <w:numId w:val="11"/>
+        </w:numPr>
+        <w:rPr>
+          <w:lang w:val="en-US"/>
+        </w:rPr>
+      </w:pPr>
+      <w:proofErr w:type="spellStart"/>
+      <w:r>
+        <w:rPr>
+          <w:lang w:val="en-US"/>
+        </w:rPr>
+        <w:t>EndOfDay</w:t>
+      </w:r>
+      <w:proofErr w:type="spellEnd"/>
+      <w:r>
+        <w:rPr>
+          <w:lang w:val="en-US"/>
+        </w:rPr>
+        <w:t>/exchangeRate.xlsx</w:t>
+      </w:r>
+    </w:p>
+    <w:p>
+      <w:pPr>
+        <w:pStyle w:val="ListParagraph"/>
+        <w:numPr>
+          <w:ilvl w:val="1"/>
+          <w:numId w:val="11"/>
+        </w:numPr>
+        <w:rPr>
+          <w:lang w:val="en-US"/>
+        </w:rPr>
+      </w:pPr>
+      <w:proofErr w:type="spellStart"/>
+      <w:r>
+        <w:rPr>
+          <w:lang w:val="en-US"/>
+        </w:rPr>
+        <w:t>EndOfDay</w:t>
+      </w:r>
+      <w:proofErr w:type="spellEnd"/>
+      <w:r>
+        <w:rPr>
+          <w:lang w:val="en-US"/>
+        </w:rPr>
+        <w:t>/exchangeRates.xlsx</w:t>
       </w:r>
     </w:p>
     <w:p>
@@ -458,7 +866,21 @@
         <w:rPr>
           <w:lang w:val="en-US"/>
         </w:rPr>
-        <w:t>Bug fixes on DownloadPositionAndDetails API Request (redundant fields removal)</w:t>
+        <w:t xml:space="preserve">Bug fixes on </w:t>
+      </w:r>
+      <w:proofErr w:type="spellStart"/>
+      <w:r>
+        <w:rPr>
+          <w:lang w:val="en-US"/>
+        </w:rPr>
+        <w:t>DownloadPositionAndDetails</w:t>
+      </w:r>
+      <w:proofErr w:type="spellEnd"/>
+      <w:r>
+        <w:rPr>
+          <w:lang w:val="en-US"/>
+        </w:rPr>
+        <w:t xml:space="preserve"> API Request (redundant fields removal)</w:t>
       </w:r>
     </w:p>
     <w:p>
@@ -559,7 +981,35 @@
         <w:rPr>
           <w:lang w:val="en-US"/>
         </w:rPr>
-        <w:t xml:space="preserve">New array CbsFees to DownloadRepaymentScheduleSim API Request method to pass to CBS the fees of the product. (excel documentation file also modified) </w:t>
+        <w:t xml:space="preserve">New array </w:t>
+      </w:r>
+      <w:proofErr w:type="spellStart"/>
+      <w:r>
+        <w:rPr>
+          <w:lang w:val="en-US"/>
+        </w:rPr>
+        <w:t>CbsFees</w:t>
+      </w:r>
+      <w:proofErr w:type="spellEnd"/>
+      <w:r>
+        <w:rPr>
+          <w:lang w:val="en-US"/>
+        </w:rPr>
+        <w:t xml:space="preserve"> to </w:t>
+      </w:r>
+      <w:proofErr w:type="spellStart"/>
+      <w:r>
+        <w:rPr>
+          <w:lang w:val="en-US"/>
+        </w:rPr>
+        <w:t>DownloadRepaymentScheduleSim</w:t>
+      </w:r>
+      <w:proofErr w:type="spellEnd"/>
+      <w:r>
+        <w:rPr>
+          <w:lang w:val="en-US"/>
+        </w:rPr>
+        <w:t xml:space="preserve"> API Request method to pass to CBS the fees of the product. (excel documentation file also modified) </w:t>
       </w:r>
     </w:p>
     <w:p>
@@ -580,8 +1030,30 @@
         <w:rPr>
           <w:lang w:val="en-US"/>
         </w:rPr>
-        <w:t>New CBS_API.json to incorporate the modifications of the DownloadRepaymentScheduleSim</w:t>
-      </w:r>
+        <w:t xml:space="preserve">New </w:t>
+      </w:r>
+      <w:proofErr w:type="spellStart"/>
+      <w:r>
+        <w:rPr>
+          <w:lang w:val="en-US"/>
+        </w:rPr>
+        <w:t>CBS_API.json</w:t>
+      </w:r>
+      <w:proofErr w:type="spellEnd"/>
+      <w:r>
+        <w:rPr>
+          <w:lang w:val="en-US"/>
+        </w:rPr>
+        <w:t xml:space="preserve"> to incorporate the modifications of the </w:t>
+      </w:r>
+      <w:proofErr w:type="spellStart"/>
+      <w:r>
+        <w:rPr>
+          <w:lang w:val="en-US"/>
+        </w:rPr>
+        <w:t>DownloadRepaymentScheduleSim</w:t>
+      </w:r>
+      <w:proofErr w:type="spellEnd"/>
     </w:p>
     <w:p>
       <w:pPr>
@@ -699,14 +1171,17 @@
         <w:rPr>
           <w:lang w:val="en-US"/>
         </w:rPr>
+        <w:lastRenderedPageBreak/>
         <w:t xml:space="preserve">Updated </w:t>
       </w:r>
+      <w:proofErr w:type="spellStart"/>
       <w:r>
         <w:rPr>
           <w:lang w:val="en-US"/>
         </w:rPr>
         <w:t>CCBS_API.json</w:t>
       </w:r>
+      <w:proofErr w:type="spellEnd"/>
       <w:r>
         <w:rPr>
           <w:lang w:val="en-US"/>
@@ -775,11 +1250,19 @@
         </w:rPr>
         <w:t>~/</w:t>
       </w:r>
-      <w:r>
-        <w:rPr>
-          <w:lang w:val="en-US"/>
-        </w:rPr>
-        <w:t>RepaymentSchedule/RepaymentSchedule_Simulation.xlsx</w:t>
+      <w:proofErr w:type="spellStart"/>
+      <w:r>
+        <w:rPr>
+          <w:lang w:val="en-US"/>
+        </w:rPr>
+        <w:t>RepaymentSchedule</w:t>
+      </w:r>
+      <w:proofErr w:type="spellEnd"/>
+      <w:r>
+        <w:rPr>
+          <w:lang w:val="en-US"/>
+        </w:rPr>
+        <w:t>/RepaymentSchedule_Simulation.xlsx</w:t>
       </w:r>
     </w:p>
     <w:p>
@@ -834,15 +1317,16 @@
         <w:rPr>
           <w:lang w:val="en-US"/>
         </w:rPr>
-        <w:lastRenderedPageBreak/>
         <w:t xml:space="preserve">Modifications to </w:t>
       </w:r>
+      <w:proofErr w:type="spellStart"/>
       <w:r>
         <w:rPr>
           <w:lang w:val="en-US"/>
         </w:rPr>
         <w:t>RepaymentSchedule_Simulation</w:t>
       </w:r>
+      <w:proofErr w:type="spellEnd"/>
       <w:r>
         <w:rPr>
           <w:lang w:val="en-US"/>
@@ -1465,14 +1949,30 @@
         <w:rPr>
           <w:lang w:val="en-US"/>
         </w:rPr>
-        <w:t>More comments added to the OpenAPI Specification (</w:t>
-      </w:r>
+        <w:t xml:space="preserve">More comments added to the </w:t>
+      </w:r>
+      <w:proofErr w:type="spellStart"/>
+      <w:r>
+        <w:rPr>
+          <w:lang w:val="en-US"/>
+        </w:rPr>
+        <w:t>OpenAPI</w:t>
+      </w:r>
+      <w:proofErr w:type="spellEnd"/>
+      <w:r>
+        <w:rPr>
+          <w:lang w:val="en-US"/>
+        </w:rPr>
+        <w:t xml:space="preserve"> Specification (</w:t>
+      </w:r>
+      <w:proofErr w:type="spellStart"/>
       <w:r>
         <w:rPr>
           <w:lang w:val="en-US"/>
         </w:rPr>
         <w:t>CCBS_API.json</w:t>
       </w:r>
+      <w:proofErr w:type="spellEnd"/>
       <w:r>
         <w:rPr>
           <w:lang w:val="en-US"/>
@@ -1592,7 +2092,21 @@
         <w:rPr>
           <w:lang w:val="en-US"/>
         </w:rPr>
-        <w:t>Minor model changes to adapt the latest i-Apply version.</w:t>
+        <w:t xml:space="preserve">Minor model changes to adapt the latest </w:t>
+      </w:r>
+      <w:proofErr w:type="spellStart"/>
+      <w:r>
+        <w:rPr>
+          <w:lang w:val="en-US"/>
+        </w:rPr>
+        <w:t>i</w:t>
+      </w:r>
+      <w:proofErr w:type="spellEnd"/>
+      <w:r>
+        <w:rPr>
+          <w:lang w:val="en-US"/>
+        </w:rPr>
+        <w:t>-Apply version.</w:t>
       </w:r>
     </w:p>
     <w:p>
@@ -1727,7 +2241,21 @@
         <w:rPr>
           <w:lang w:val="en-US"/>
         </w:rPr>
-        <w:t xml:space="preserve">CCBS.docx: Add the paragraph “Recommended OpenAPI Tools” </w:t>
+        <w:t xml:space="preserve">CCBS.docx: Add the paragraph “Recommended </w:t>
+      </w:r>
+      <w:proofErr w:type="spellStart"/>
+      <w:r>
+        <w:rPr>
+          <w:lang w:val="en-US"/>
+        </w:rPr>
+        <w:t>OpenAPI</w:t>
+      </w:r>
+      <w:proofErr w:type="spellEnd"/>
+      <w:r>
+        <w:rPr>
+          <w:lang w:val="en-US"/>
+        </w:rPr>
+        <w:t xml:space="preserve"> Tools” </w:t>
       </w:r>
     </w:p>
     <w:p>
@@ -1848,12 +2376,14 @@
           <w:lang w:val="en-US"/>
         </w:rPr>
       </w:pPr>
+      <w:proofErr w:type="spellStart"/>
       <w:r>
         <w:rPr>
           <w:lang w:val="en-US"/>
         </w:rPr>
         <w:t>CCBS_API.json</w:t>
       </w:r>
+      <w:proofErr w:type="spellEnd"/>
       <w:r>
         <w:rPr>
           <w:lang w:val="en-US"/>

</xml_diff>